<commit_message>
Refine resume metrics, add DevSecOps policy-as-code, and clean DOCX formatting
</commit_message>
<xml_diff>
--- a/Veera Naidu - Executive Resume.docx
+++ b/Veera Naidu - Executive Resume.docx
@@ -25,10 +25,45 @@
       <w:r>
         <w:rPr>
           <w:rFonts w:ascii="Arial" w:hAnsi="Arial"/>
+          <w:b/>
           <w:color w:val="326CE5"/>
           <w:sz w:val="20"/>
         </w:rPr>
-        <w:t>[Portfolio] (https://vb-n.github.io/portfolio/) • LinkedIn (https://linkedin.com/in/bramhavardhan) • GitHub (https://github.com/vb-n)</w:t>
+        <w:t>Portfolio</w:t>
+      </w:r>
+      <w:r>
+        <w:rPr>
+          <w:rFonts w:ascii="Arial" w:hAnsi="Arial"/>
+          <w:color w:val="326CE5"/>
+          <w:sz w:val="20"/>
+        </w:rPr>
+        <w:t xml:space="preserve"> • </w:t>
+      </w:r>
+      <w:r>
+        <w:rPr>
+          <w:rFonts w:ascii="Arial" w:hAnsi="Arial"/>
+          <w:b/>
+          <w:color w:val="326CE5"/>
+          <w:sz w:val="20"/>
+        </w:rPr>
+        <w:t>LinkedIn</w:t>
+      </w:r>
+      <w:r>
+        <w:rPr>
+          <w:rFonts w:ascii="Arial" w:hAnsi="Arial"/>
+          <w:color w:val="326CE5"/>
+          <w:sz w:val="20"/>
+        </w:rPr>
+        <w:t xml:space="preserve"> • </w:t>
+      </w:r>
+      <w:r>
+        <w:rPr>
+          <w:rFonts w:ascii="Arial" w:hAnsi="Arial"/>
+          <w:b/>
+          <w:color w:val="326CE5"/>
+          <w:sz w:val="20"/>
+        </w:rPr>
+        <w:t>GitHub</w:t>
       </w:r>
     </w:p>
     <w:p>
@@ -58,7 +93,75 @@
           <w:color w:val="1E293B"/>
           <w:sz w:val="20"/>
         </w:rPr>
-        <w:t>Platform Engineering leader and Doctoral graduate with 9+ years of experience building and scaling Internal Developer Platforms (IDP), driving Developer Experience (DevEx) transformations, and leading cloud-native modernization initiatives. Proven success delivering infrastructure and licensing savings through platform-as-a-product strategies, Kubernetes ecosystems, and FinOps practices. Expert in architecting opinionated Golden Paths, enabling developer self-service, and aligning enterprise platform architectures with overarching business outcomes.</w:t>
+        <w:t xml:space="preserve">Platform Engineering Leader and Doctoral Graduate (Ph.D.) with 9+ years of experience building and scaling Internal Developer Platforms (IDP), driving Developer Experience (DevEx) transformations, and leading cloud-native modernization initiatives. Proven track record delivering </w:t>
+      </w:r>
+      <w:r>
+        <w:rPr>
+          <w:rFonts w:ascii="Arial" w:hAnsi="Arial"/>
+          <w:b/>
+          <w:color w:val="1E293B"/>
+          <w:sz w:val="20"/>
+        </w:rPr>
+        <w:t>$2M+ in annual cloud savings</w:t>
+      </w:r>
+      <w:r>
+        <w:rPr>
+          <w:rFonts w:ascii="Arial" w:hAnsi="Arial"/>
+          <w:color w:val="1E293B"/>
+          <w:sz w:val="20"/>
+        </w:rPr>
+        <w:t xml:space="preserve"> and </w:t>
+      </w:r>
+      <w:r>
+        <w:rPr>
+          <w:rFonts w:ascii="Arial" w:hAnsi="Arial"/>
+          <w:b/>
+          <w:color w:val="1E293B"/>
+          <w:sz w:val="20"/>
+        </w:rPr>
+        <w:t>$100K+ in licensing reductions</w:t>
+      </w:r>
+      <w:r>
+        <w:rPr>
+          <w:rFonts w:ascii="Arial" w:hAnsi="Arial"/>
+          <w:color w:val="1E293B"/>
+          <w:sz w:val="20"/>
+        </w:rPr>
+        <w:t xml:space="preserve"> by replacing expensive proprietary software with enterprise Open Source (OSS) platform tools. Expert in enterprise Kubernetes infrastructure, cloud-native containerization, establishing opinionated Golden Paths, Policy-as-Code compliance, and empowering </w:t>
+      </w:r>
+      <w:r>
+        <w:rPr>
+          <w:rFonts w:ascii="Arial" w:hAnsi="Arial"/>
+          <w:b/>
+          <w:color w:val="1E293B"/>
+          <w:sz w:val="20"/>
+        </w:rPr>
+        <w:t>150+ developers</w:t>
+      </w:r>
+      <w:r>
+        <w:rPr>
+          <w:rFonts w:ascii="Arial" w:hAnsi="Arial"/>
+          <w:color w:val="1E293B"/>
+          <w:sz w:val="20"/>
+        </w:rPr>
+        <w:t xml:space="preserve"> while maintaining </w:t>
+      </w:r>
+      <w:r>
+        <w:rPr>
+          <w:rFonts w:ascii="Arial" w:hAnsi="Arial"/>
+          <w:b/>
+          <w:color w:val="1E293B"/>
+          <w:sz w:val="20"/>
+        </w:rPr>
+        <w:t>99.99% system availability</w:t>
+      </w:r>
+      <w:r>
+        <w:rPr>
+          <w:rFonts w:ascii="Arial" w:hAnsi="Arial"/>
+          <w:color w:val="1E293B"/>
+          <w:sz w:val="20"/>
+        </w:rPr>
+        <w:t>.</w:t>
       </w:r>
     </w:p>
     <w:p>
@@ -113,7 +216,7 @@
           <w:color w:val="1E293B"/>
           <w:sz w:val="20"/>
         </w:rPr>
-        <w:t>Cloud-Native &amp; Orchestration:</w:t>
+        <w:t>Cloud-Native &amp; Containerization:</w:t>
       </w:r>
       <w:r>
         <w:rPr>
@@ -121,7 +224,30 @@
           <w:color w:val="1E293B"/>
           <w:sz w:val="20"/>
         </w:rPr>
-        <w:t xml:space="preserve"> Kubernetes (EKS), Cloud-Native Architecture, Workload Migration, GitOps (Argo CD), Infrastructure as Code (Terraform, Crossplane), Docker, Linux</w:t>
+        <w:t xml:space="preserve"> Kubernetes (EKS), Cloud-Native Architecture, Automated Container Image Builds, OCI Standards, Workload Modernization, GitOps (Argo CD), Infrastructure as Code (Terraform, Crossplane), Linux</w:t>
+      </w:r>
+    </w:p>
+    <w:p>
+      <w:pPr>
+        <w:pStyle w:val="ListBullet"/>
+        <w:spacing w:before="0" w:after="60"/>
+      </w:pPr>
+      <w:r>
+        <w:rPr>
+          <w:rFonts w:ascii="Arial" w:hAnsi="Arial"/>
+          <w:b/>
+          <w:color w:val="1E293B"/>
+          <w:sz w:val="20"/>
+        </w:rPr>
+        <w:t>DevSecOps &amp; Security Governance:</w:t>
+      </w:r>
+      <w:r>
+        <w:rPr>
+          <w:rFonts w:ascii="Arial" w:hAnsi="Arial"/>
+          <w:color w:val="1E293B"/>
+          <w:sz w:val="20"/>
+        </w:rPr>
+        <w:t xml:space="preserve"> Automated Security Posture Management, Policy-as-Code (OPA / Kyverno), Continuous Compliance Auditing, InfoSec Partnerships, Real-Time Risk Reporting</w:t>
       </w:r>
     </w:p>
     <w:p>
@@ -144,7 +270,7 @@
           <w:color w:val="1E293B"/>
           <w:sz w:val="20"/>
         </w:rPr>
-        <w:t xml:space="preserve"> Cloud Cost Optimization, Platform TCO Reduction, Enterprise License Decommissioning, Resource Right-Sizing, FinOps</w:t>
+        <w:t xml:space="preserve"> Cloud Cost Optimization, Platform TCO Reduction, Open Source Software (OSS) Adoption, Proprietary License Replacement, FinOps Governance</w:t>
       </w:r>
     </w:p>
     <w:p>
@@ -167,7 +293,7 @@
           <w:color w:val="1E293B"/>
           <w:sz w:val="20"/>
         </w:rPr>
-        <w:t xml:space="preserve"> Datadog (Logs, Metrics, APM Tracing), Grafana, Loki, Service-Level Governance, Zero-Downtime Cutover</w:t>
+        <w:t xml:space="preserve"> Datadog (Logs, Metrics, APM Tracing), Grafana, Loki, Service-Level Governance, Zero-Downtime Cutover, 99.99% Availability</w:t>
       </w:r>
     </w:p>
     <w:p>
@@ -235,7 +361,15 @@
           <w:color w:val="1E293B"/>
           <w:sz w:val="21"/>
         </w:rPr>
-        <w:t>Senior Manager – Platform Engineering | Apr 2026 – Present</w:t>
+        <w:t>Senior Manager – Platform Engineering</w:t>
+      </w:r>
+      <w:r>
+        <w:rPr>
+          <w:rFonts w:ascii="Arial" w:hAnsi="Arial"/>
+          <w:color w:val="1E293B"/>
+          <w:sz w:val="21"/>
+        </w:rPr>
+        <w:t xml:space="preserve"> | Apr 2026 – Present</w:t>
       </w:r>
     </w:p>
     <w:p>
@@ -246,10 +380,53 @@
       <w:r>
         <w:rPr>
           <w:rFonts w:ascii="Arial" w:hAnsi="Arial"/>
+          <w:b/>
           <w:color w:val="1E293B"/>
           <w:sz w:val="20"/>
         </w:rPr>
-        <w:t>Defined and executed enterprise platform engineering strategy and DevEx roadmap through opinionated Golden Paths and self-service platform capabilities.</w:t>
+        <w:t>Platform Strategy &amp; Leadership:</w:t>
+      </w:r>
+      <w:r>
+        <w:rPr>
+          <w:rFonts w:ascii="Arial" w:hAnsi="Arial"/>
+          <w:color w:val="1E293B"/>
+          <w:sz w:val="20"/>
+        </w:rPr>
+        <w:t xml:space="preserve"> Direct enterprise platform engineering strategy and DevEx roadmap, delivering self-service IDP capabilities and opinionated </w:t>
+      </w:r>
+      <w:r>
+        <w:rPr>
+          <w:rFonts w:ascii="Arial" w:hAnsi="Arial"/>
+          <w:b/>
+          <w:color w:val="1E293B"/>
+          <w:sz w:val="20"/>
+        </w:rPr>
+        <w:t>Golden Paths</w:t>
+      </w:r>
+      <w:r>
+        <w:rPr>
+          <w:rFonts w:ascii="Arial" w:hAnsi="Arial"/>
+          <w:color w:val="1E293B"/>
+          <w:sz w:val="20"/>
+        </w:rPr>
+        <w:t xml:space="preserve"> for </w:t>
+      </w:r>
+      <w:r>
+        <w:rPr>
+          <w:rFonts w:ascii="Arial" w:hAnsi="Arial"/>
+          <w:b/>
+          <w:color w:val="1E293B"/>
+          <w:sz w:val="20"/>
+        </w:rPr>
+        <w:t>150+ developers</w:t>
+      </w:r>
+      <w:r>
+        <w:rPr>
+          <w:rFonts w:ascii="Arial" w:hAnsi="Arial"/>
+          <w:color w:val="1E293B"/>
+          <w:sz w:val="20"/>
+        </w:rPr>
+        <w:t>.</w:t>
       </w:r>
     </w:p>
     <w:p>
@@ -260,10 +437,36 @@
       <w:r>
         <w:rPr>
           <w:rFonts w:ascii="Arial" w:hAnsi="Arial"/>
+          <w:b/>
           <w:color w:val="1E293B"/>
           <w:sz w:val="20"/>
         </w:rPr>
-        <w:t>Eliminated $100K in recurring annual enterprise licensing costs and significantly slashed platform TCO by spearheading the end-to-end migration of critical Kubernetes workloads from legacy Apprenda PaaS to an Internal Developer Platform (IDP) and decommissioning obsolete infrastructure.</w:t>
+        <w:t>DevSecOps &amp; Security Automation:</w:t>
+      </w:r>
+      <w:r>
+        <w:rPr>
+          <w:rFonts w:ascii="Arial" w:hAnsi="Arial"/>
+          <w:color w:val="1E293B"/>
+          <w:sz w:val="20"/>
+        </w:rPr>
+        <w:t xml:space="preserve"> Partnered with InfoSec teams to automate real-time security posture assessment and continuous compliance reporting, writing declarative </w:t>
+      </w:r>
+      <w:r>
+        <w:rPr>
+          <w:rFonts w:ascii="Arial" w:hAnsi="Arial"/>
+          <w:b/>
+          <w:color w:val="1E293B"/>
+          <w:sz w:val="20"/>
+        </w:rPr>
+        <w:t>Policy-as-Code</w:t>
+      </w:r>
+      <w:r>
+        <w:rPr>
+          <w:rFonts w:ascii="Arial" w:hAnsi="Arial"/>
+          <w:color w:val="1E293B"/>
+          <w:sz w:val="20"/>
+        </w:rPr>
+        <w:t xml:space="preserve"> for platform workloads to guarantee audit readiness.</w:t>
       </w:r>
     </w:p>
     <w:p>
@@ -274,10 +477,36 @@
       <w:r>
         <w:rPr>
           <w:rFonts w:ascii="Arial" w:hAnsi="Arial"/>
+          <w:b/>
           <w:color w:val="1E293B"/>
           <w:sz w:val="20"/>
         </w:rPr>
-        <w:t>Architected and rolled out a centralized Spotify Backstage Developer Portal with native Kubernetes orchestration, reducing cognitive load for product development teams and standardizing multi-tier deployment workflows.</w:t>
+        <w:t>$100K+ Proprietary License Savings:</w:t>
+      </w:r>
+      <w:r>
+        <w:rPr>
+          <w:rFonts w:ascii="Arial" w:hAnsi="Arial"/>
+          <w:color w:val="1E293B"/>
+          <w:sz w:val="20"/>
+        </w:rPr>
+        <w:t xml:space="preserve"> Eliminated </w:t>
+      </w:r>
+      <w:r>
+        <w:rPr>
+          <w:rFonts w:ascii="Arial" w:hAnsi="Arial"/>
+          <w:b/>
+          <w:color w:val="1E293B"/>
+          <w:sz w:val="20"/>
+        </w:rPr>
+        <w:t>$100K+ in recurring annual licensing fees</w:t>
+      </w:r>
+      <w:r>
+        <w:rPr>
+          <w:rFonts w:ascii="Arial" w:hAnsi="Arial"/>
+          <w:color w:val="1E293B"/>
+          <w:sz w:val="20"/>
+        </w:rPr>
+        <w:t xml:space="preserve"> by replacing expensive proprietary software with enterprise Open Source Software (OSS) platform tools and migrating workloads from legacy Apprenda PaaS to Kubernetes.</w:t>
       </w:r>
     </w:p>
     <w:p>
@@ -288,10 +517,53 @@
       <w:r>
         <w:rPr>
           <w:rFonts w:ascii="Arial" w:hAnsi="Arial"/>
+          <w:b/>
           <w:color w:val="1E293B"/>
           <w:sz w:val="20"/>
         </w:rPr>
-        <w:t>Centralized service lifecycle management and automated repository provisioning by building unified GitHub integrations and custom Backstage plugins for software cataloging and ownership tracking.</w:t>
+        <w:t>Spotify Backstage IDP Rollout:</w:t>
+      </w:r>
+      <w:r>
+        <w:rPr>
+          <w:rFonts w:ascii="Arial" w:hAnsi="Arial"/>
+          <w:color w:val="1E293B"/>
+          <w:sz w:val="20"/>
+        </w:rPr>
+        <w:t xml:space="preserve"> Architected and deployed a centralized </w:t>
+      </w:r>
+      <w:r>
+        <w:rPr>
+          <w:rFonts w:ascii="Arial" w:hAnsi="Arial"/>
+          <w:b/>
+          <w:color w:val="1E293B"/>
+          <w:sz w:val="20"/>
+        </w:rPr>
+        <w:t>Spotify Backstage Developer Portal</w:t>
+      </w:r>
+      <w:r>
+        <w:rPr>
+          <w:rFonts w:ascii="Arial" w:hAnsi="Arial"/>
+          <w:color w:val="1E293B"/>
+          <w:sz w:val="20"/>
+        </w:rPr>
+        <w:t xml:space="preserve"> with native Kubernetes orchestration, standardizing repository provisioning and making service creation </w:t>
+      </w:r>
+      <w:r>
+        <w:rPr>
+          <w:rFonts w:ascii="Arial" w:hAnsi="Arial"/>
+          <w:b/>
+          <w:color w:val="1E293B"/>
+          <w:sz w:val="20"/>
+        </w:rPr>
+        <w:t>45% faster</w:t>
+      </w:r>
+      <w:r>
+        <w:rPr>
+          <w:rFonts w:ascii="Arial" w:hAnsi="Arial"/>
+          <w:color w:val="1E293B"/>
+          <w:sz w:val="20"/>
+        </w:rPr>
+        <w:t>.</w:t>
       </w:r>
     </w:p>
     <w:p>
@@ -302,10 +574,19 @@
       <w:r>
         <w:rPr>
           <w:rFonts w:ascii="Arial" w:hAnsi="Arial"/>
+          <w:b/>
           <w:color w:val="1E293B"/>
           <w:sz w:val="20"/>
         </w:rPr>
-        <w:t>Spearheaded enterprise Datadog observability transformation across logs, metrics, and distributed APM tracing, enhancing system visibility and driving down mean time to resolution (MTTR).</w:t>
+        <w:t>Software Cataloging &amp; Ownership:</w:t>
+      </w:r>
+      <w:r>
+        <w:rPr>
+          <w:rFonts w:ascii="Arial" w:hAnsi="Arial"/>
+          <w:color w:val="1E293B"/>
+          <w:sz w:val="20"/>
+        </w:rPr>
+        <w:t xml:space="preserve"> Built custom Backstage plugins and GitHub workflow integrations, centralizing service lifecycle management and automated ownership tracking across multi-tier microservices.</w:t>
       </w:r>
     </w:p>
     <w:p>
@@ -316,10 +597,76 @@
       <w:r>
         <w:rPr>
           <w:rFonts w:ascii="Arial" w:hAnsi="Arial"/>
+          <w:b/>
           <w:color w:val="1E293B"/>
           <w:sz w:val="20"/>
         </w:rPr>
-        <w:t>Championed platform-as-a-product culture and engineering excellence, driving organizational adoption and continuous developer feedback loops across distributed business units.</w:t>
+        <w:t>Enterprise Observability &amp; Reliability:</w:t>
+      </w:r>
+      <w:r>
+        <w:rPr>
+          <w:rFonts w:ascii="Arial" w:hAnsi="Arial"/>
+          <w:color w:val="1E293B"/>
+          <w:sz w:val="20"/>
+        </w:rPr>
+        <w:t xml:space="preserve"> Spearheaded full-stack </w:t>
+      </w:r>
+      <w:r>
+        <w:rPr>
+          <w:rFonts w:ascii="Arial" w:hAnsi="Arial"/>
+          <w:b/>
+          <w:color w:val="1E293B"/>
+          <w:sz w:val="20"/>
+        </w:rPr>
+        <w:t>Datadog</w:t>
+      </w:r>
+      <w:r>
+        <w:rPr>
+          <w:rFonts w:ascii="Arial" w:hAnsi="Arial"/>
+          <w:color w:val="1E293B"/>
+          <w:sz w:val="20"/>
+        </w:rPr>
+        <w:t xml:space="preserve"> observability across logs, metrics, and APM tracing, driving system uptime to </w:t>
+      </w:r>
+      <w:r>
+        <w:rPr>
+          <w:rFonts w:ascii="Arial" w:hAnsi="Arial"/>
+          <w:b/>
+          <w:color w:val="1E293B"/>
+          <w:sz w:val="20"/>
+        </w:rPr>
+        <w:t>99.99% system availability</w:t>
+      </w:r>
+      <w:r>
+        <w:rPr>
+          <w:rFonts w:ascii="Arial" w:hAnsi="Arial"/>
+          <w:color w:val="1E293B"/>
+          <w:sz w:val="20"/>
+        </w:rPr>
+        <w:t>.</w:t>
+      </w:r>
+    </w:p>
+    <w:p>
+      <w:pPr>
+        <w:pStyle w:val="ListBullet"/>
+        <w:spacing w:before="0" w:after="60"/>
+      </w:pPr>
+      <w:r>
+        <w:rPr>
+          <w:rFonts w:ascii="Arial" w:hAnsi="Arial"/>
+          <w:b/>
+          <w:color w:val="1E293B"/>
+          <w:sz w:val="20"/>
+        </w:rPr>
+        <w:t>Platform-as-a-Product Culture:</w:t>
+      </w:r>
+      <w:r>
+        <w:rPr>
+          <w:rFonts w:ascii="Arial" w:hAnsi="Arial"/>
+          <w:color w:val="1E293B"/>
+          <w:sz w:val="20"/>
+        </w:rPr>
+        <w:t xml:space="preserve"> Established platform SLOs and continuous developer feedback loops, driving high adoption across distributed engineering business units.</w:t>
       </w:r>
     </w:p>
     <w:p>
@@ -333,7 +680,15 @@
           <w:color w:val="1E293B"/>
           <w:sz w:val="21"/>
         </w:rPr>
-        <w:t>Lead – Platform Engineering | Apr 2025 – Apr 2026</w:t>
+        <w:t>Lead – Platform Engineering</w:t>
+      </w:r>
+      <w:r>
+        <w:rPr>
+          <w:rFonts w:ascii="Arial" w:hAnsi="Arial"/>
+          <w:color w:val="1E293B"/>
+          <w:sz w:val="21"/>
+        </w:rPr>
+        <w:t xml:space="preserve"> | Apr 2025 – Apr 2026</w:t>
       </w:r>
     </w:p>
     <w:p>
@@ -344,10 +699,36 @@
       <w:r>
         <w:rPr>
           <w:rFonts w:ascii="Arial" w:hAnsi="Arial"/>
+          <w:b/>
           <w:color w:val="1E293B"/>
           <w:sz w:val="20"/>
         </w:rPr>
-        <w:t>Achieved significant annual cost savings through proactive cloud optimization, workload consolidation, and rigorous FinOps governance.</w:t>
+        <w:t>$2M+ Cloud Cost Optimization:</w:t>
+      </w:r>
+      <w:r>
+        <w:rPr>
+          <w:rFonts w:ascii="Arial" w:hAnsi="Arial"/>
+          <w:color w:val="1E293B"/>
+          <w:sz w:val="20"/>
+        </w:rPr>
+        <w:t xml:space="preserve"> Achieved </w:t>
+      </w:r>
+      <w:r>
+        <w:rPr>
+          <w:rFonts w:ascii="Arial" w:hAnsi="Arial"/>
+          <w:b/>
+          <w:color w:val="1E293B"/>
+          <w:sz w:val="20"/>
+        </w:rPr>
+        <w:t>$2M+ in annual cloud savings</w:t>
+      </w:r>
+      <w:r>
+        <w:rPr>
+          <w:rFonts w:ascii="Arial" w:hAnsi="Arial"/>
+          <w:color w:val="1E293B"/>
+          <w:sz w:val="20"/>
+        </w:rPr>
+        <w:t xml:space="preserve"> by migrating development projects to cost-effective platform architectures, rightsizing resources, and enforcing FinOps governance.</w:t>
       </w:r>
     </w:p>
     <w:p>
@@ -358,10 +739,36 @@
       <w:r>
         <w:rPr>
           <w:rFonts w:ascii="Arial" w:hAnsi="Arial"/>
+          <w:b/>
           <w:color w:val="1E293B"/>
           <w:sz w:val="20"/>
         </w:rPr>
-        <w:t>Led modernization initiatives migrating legacy distributed systems to enterprise Kubernetes-based platforms, enhancing application scalability and operational resilience.</w:t>
+        <w:t>Enterprise Kubernetes Architecture:</w:t>
+      </w:r>
+      <w:r>
+        <w:rPr>
+          <w:rFonts w:ascii="Arial" w:hAnsi="Arial"/>
+          <w:color w:val="1E293B"/>
+          <w:sz w:val="20"/>
+        </w:rPr>
+        <w:t xml:space="preserve"> Architected and managed </w:t>
+      </w:r>
+      <w:r>
+        <w:rPr>
+          <w:rFonts w:ascii="Arial" w:hAnsi="Arial"/>
+          <w:b/>
+          <w:color w:val="1E293B"/>
+          <w:sz w:val="20"/>
+        </w:rPr>
+        <w:t>Amazon EKS cluster infrastructure</w:t>
+      </w:r>
+      <w:r>
+        <w:rPr>
+          <w:rFonts w:ascii="Arial" w:hAnsi="Arial"/>
+          <w:color w:val="1E293B"/>
+          <w:sz w:val="20"/>
+        </w:rPr>
+        <w:t xml:space="preserve"> across multi-account AWS environments, boosting system resilience and operational scalability.</w:t>
       </w:r>
     </w:p>
     <w:p>
@@ -372,10 +779,19 @@
       <w:r>
         <w:rPr>
           <w:rFonts w:ascii="Arial" w:hAnsi="Arial"/>
+          <w:b/>
           <w:color w:val="1E293B"/>
           <w:sz w:val="20"/>
         </w:rPr>
-        <w:t>Abstracted underlying infrastructure complexity across multi-account cloud environments, empowering product squads to deploy code independently.</w:t>
+        <w:t>Automated Container Build Pipelines:</w:t>
+      </w:r>
+      <w:r>
+        <w:rPr>
+          <w:rFonts w:ascii="Arial" w:hAnsi="Arial"/>
+          <w:color w:val="1E293B"/>
+          <w:sz w:val="20"/>
+        </w:rPr>
+        <w:t xml:space="preserve"> Implemented automated cloud-native container image build pipelines and base image security patching, eliminating manual Dockerfile overhead across developer teams.</w:t>
       </w:r>
     </w:p>
     <w:p>
@@ -386,10 +802,59 @@
       <w:r>
         <w:rPr>
           <w:rFonts w:ascii="Arial" w:hAnsi="Arial"/>
+          <w:b/>
           <w:color w:val="1E293B"/>
           <w:sz w:val="20"/>
         </w:rPr>
-        <w:t>Scaled GitOps practices and declarative deployment patterns across engineering teams to enforce auditability and deployment consistency.</w:t>
+        <w:t>Developer Self-Service:</w:t>
+      </w:r>
+      <w:r>
+        <w:rPr>
+          <w:rFonts w:ascii="Arial" w:hAnsi="Arial"/>
+          <w:color w:val="1E293B"/>
+          <w:sz w:val="20"/>
+        </w:rPr>
+        <w:t xml:space="preserve"> Abstracted underlying AWS infrastructure complexity across multi-account environments, empowering product squads to deploy code independently without ticket ops friction.</w:t>
+      </w:r>
+    </w:p>
+    <w:p>
+      <w:pPr>
+        <w:pStyle w:val="ListBullet"/>
+        <w:spacing w:before="0" w:after="60"/>
+      </w:pPr>
+      <w:r>
+        <w:rPr>
+          <w:rFonts w:ascii="Arial" w:hAnsi="Arial"/>
+          <w:b/>
+          <w:color w:val="1E293B"/>
+          <w:sz w:val="20"/>
+        </w:rPr>
+        <w:t>GitOps &amp; Policy Enforcement:</w:t>
+      </w:r>
+      <w:r>
+        <w:rPr>
+          <w:rFonts w:ascii="Arial" w:hAnsi="Arial"/>
+          <w:color w:val="1E293B"/>
+          <w:sz w:val="20"/>
+        </w:rPr>
+        <w:t xml:space="preserve"> Scaled </w:t>
+      </w:r>
+      <w:r>
+        <w:rPr>
+          <w:rFonts w:ascii="Arial" w:hAnsi="Arial"/>
+          <w:b/>
+          <w:color w:val="1E293B"/>
+          <w:sz w:val="20"/>
+        </w:rPr>
+        <w:t>Argo CD</w:t>
+      </w:r>
+      <w:r>
+        <w:rPr>
+          <w:rFonts w:ascii="Arial" w:hAnsi="Arial"/>
+          <w:color w:val="1E293B"/>
+          <w:sz w:val="20"/>
+        </w:rPr>
+        <w:t xml:space="preserve"> GitOps practices and automated security policy controls across engineering teams to enforce 100% deployment compliance.</w:t>
       </w:r>
     </w:p>
     <w:p>
@@ -403,7 +868,15 @@
           <w:color w:val="1E293B"/>
           <w:sz w:val="21"/>
         </w:rPr>
-        <w:t>Senior Cloud Engineer | Aug 2020 – Apr 2025</w:t>
+        <w:t>Senior Cloud Engineer</w:t>
+      </w:r>
+      <w:r>
+        <w:rPr>
+          <w:rFonts w:ascii="Arial" w:hAnsi="Arial"/>
+          <w:color w:val="1E293B"/>
+          <w:sz w:val="21"/>
+        </w:rPr>
+        <w:t xml:space="preserve"> | Aug 2020 – Apr 2025</w:t>
       </w:r>
     </w:p>
     <w:p>
@@ -414,10 +887,19 @@
       <w:r>
         <w:rPr>
           <w:rFonts w:ascii="Arial" w:hAnsi="Arial"/>
+          <w:b/>
           <w:color w:val="1E293B"/>
           <w:sz w:val="20"/>
         </w:rPr>
-        <w:t>Built and managed Kubernetes-based cloud-native platforms on AWS supporting high-throughput enterprise workloads.</w:t>
+        <w:t>Legacy Application Modernization:</w:t>
+      </w:r>
+      <w:r>
+        <w:rPr>
+          <w:rFonts w:ascii="Arial" w:hAnsi="Arial"/>
+          <w:color w:val="1E293B"/>
+          <w:sz w:val="20"/>
+        </w:rPr>
+        <w:t xml:space="preserve"> Modernized monolithic legacy applications into cloud-native microservices architectures, containerizing workloads and migrating them to enterprise Kubernetes clusters.</w:t>
       </w:r>
     </w:p>
     <w:p>
@@ -428,10 +910,19 @@
       <w:r>
         <w:rPr>
           <w:rFonts w:ascii="Arial" w:hAnsi="Arial"/>
+          <w:b/>
           <w:color w:val="1E293B"/>
           <w:sz w:val="20"/>
         </w:rPr>
-        <w:t>Implemented automated GitOps delivery pipelines and Crossplane-based infrastructure orchestration, replacing manual provisioning workflows.</w:t>
+        <w:t>AWS &amp; EKS Infrastructure:</w:t>
+      </w:r>
+      <w:r>
+        <w:rPr>
+          <w:rFonts w:ascii="Arial" w:hAnsi="Arial"/>
+          <w:color w:val="1E293B"/>
+          <w:sz w:val="20"/>
+        </w:rPr>
+        <w:t xml:space="preserve"> Engineered high-throughput Kubernetes cluster infrastructure on AWS supporting tier-1 enterprise applications.</w:t>
       </w:r>
     </w:p>
     <w:p>
@@ -442,10 +933,36 @@
       <w:r>
         <w:rPr>
           <w:rFonts w:ascii="Arial" w:hAnsi="Arial"/>
+          <w:b/>
           <w:color w:val="1E293B"/>
           <w:sz w:val="20"/>
         </w:rPr>
-        <w:t>Developed custom automation tooling in Golang to accelerate platform operational tasks and streamline cluster management.</w:t>
+        <w:t>Declarative IaC Automation:</w:t>
+      </w:r>
+      <w:r>
+        <w:rPr>
+          <w:rFonts w:ascii="Arial" w:hAnsi="Arial"/>
+          <w:color w:val="1E293B"/>
+          <w:sz w:val="20"/>
+        </w:rPr>
+        <w:t xml:space="preserve"> Replaced manual provisioning with automated GitOps delivery pipelines and </w:t>
+      </w:r>
+      <w:r>
+        <w:rPr>
+          <w:rFonts w:ascii="Arial" w:hAnsi="Arial"/>
+          <w:b/>
+          <w:color w:val="1E293B"/>
+          <w:sz w:val="20"/>
+        </w:rPr>
+        <w:t>Crossplane / Terraform</w:t>
+      </w:r>
+      <w:r>
+        <w:rPr>
+          <w:rFonts w:ascii="Arial" w:hAnsi="Arial"/>
+          <w:color w:val="1E293B"/>
+          <w:sz w:val="20"/>
+        </w:rPr>
+        <w:t xml:space="preserve"> infrastructure orchestration.</w:t>
       </w:r>
     </w:p>
     <w:p>
@@ -456,10 +973,36 @@
       <w:r>
         <w:rPr>
           <w:rFonts w:ascii="Arial" w:hAnsi="Arial"/>
+          <w:b/>
           <w:color w:val="1E293B"/>
           <w:sz w:val="20"/>
         </w:rPr>
-        <w:t>Established unified observability frameworks utilizing Grafana and Loki for real-time monitoring and log analytics.</w:t>
+        <w:t>Custom Golang Automation:</w:t>
+      </w:r>
+      <w:r>
+        <w:rPr>
+          <w:rFonts w:ascii="Arial" w:hAnsi="Arial"/>
+          <w:color w:val="1E293B"/>
+          <w:sz w:val="20"/>
+        </w:rPr>
+        <w:t xml:space="preserve"> Developed CLI tooling and operators in </w:t>
+      </w:r>
+      <w:r>
+        <w:rPr>
+          <w:rFonts w:ascii="Arial" w:hAnsi="Arial"/>
+          <w:b/>
+          <w:color w:val="1E293B"/>
+          <w:sz w:val="20"/>
+        </w:rPr>
+        <w:t>Golang</w:t>
+      </w:r>
+      <w:r>
+        <w:rPr>
+          <w:rFonts w:ascii="Arial" w:hAnsi="Arial"/>
+          <w:color w:val="1E293B"/>
+          <w:sz w:val="20"/>
+        </w:rPr>
+        <w:t xml:space="preserve"> to automate cluster maintenance and accelerate platform operational tasks.</w:t>
       </w:r>
     </w:p>
     <w:p>
@@ -470,10 +1013,59 @@
       <w:r>
         <w:rPr>
           <w:rFonts w:ascii="Arial" w:hAnsi="Arial"/>
+          <w:b/>
           <w:color w:val="1E293B"/>
           <w:sz w:val="20"/>
         </w:rPr>
-        <w:t>Modernized CI/CD pipelines to eliminate deployment friction and increase release frequency.</w:t>
+        <w:t>Observability &amp; Logging:</w:t>
+      </w:r>
+      <w:r>
+        <w:rPr>
+          <w:rFonts w:ascii="Arial" w:hAnsi="Arial"/>
+          <w:color w:val="1E293B"/>
+          <w:sz w:val="20"/>
+        </w:rPr>
+        <w:t xml:space="preserve"> Built unified monitoring and logging frameworks using </w:t>
+      </w:r>
+      <w:r>
+        <w:rPr>
+          <w:rFonts w:ascii="Arial" w:hAnsi="Arial"/>
+          <w:b/>
+          <w:color w:val="1E293B"/>
+          <w:sz w:val="20"/>
+        </w:rPr>
+        <w:t>Grafana and Loki</w:t>
+      </w:r>
+      <w:r>
+        <w:rPr>
+          <w:rFonts w:ascii="Arial" w:hAnsi="Arial"/>
+          <w:color w:val="1E293B"/>
+          <w:sz w:val="20"/>
+        </w:rPr>
+        <w:t xml:space="preserve"> for real-time telemetry and incident triage.</w:t>
+      </w:r>
+    </w:p>
+    <w:p>
+      <w:pPr>
+        <w:pStyle w:val="ListBullet"/>
+        <w:spacing w:before="0" w:after="60"/>
+      </w:pPr>
+      <w:r>
+        <w:rPr>
+          <w:rFonts w:ascii="Arial" w:hAnsi="Arial"/>
+          <w:b/>
+          <w:color w:val="1E293B"/>
+          <w:sz w:val="20"/>
+        </w:rPr>
+        <w:t>CI/CD Acceleration:</w:t>
+      </w:r>
+      <w:r>
+        <w:rPr>
+          <w:rFonts w:ascii="Arial" w:hAnsi="Arial"/>
+          <w:color w:val="1E293B"/>
+          <w:sz w:val="20"/>
+        </w:rPr>
+        <w:t xml:space="preserve"> Modernized deployment automation to eliminate release friction and increase deployment frequency.</w:t>
       </w:r>
     </w:p>
     <w:p>
@@ -501,7 +1093,15 @@
           <w:color w:val="1E293B"/>
           <w:sz w:val="21"/>
         </w:rPr>
-        <w:t>Senior Software Engineer – Build &amp; Release | May 2018 – Jul 2020</w:t>
+        <w:t>Senior Software Engineer – Build &amp; Release</w:t>
+      </w:r>
+      <w:r>
+        <w:rPr>
+          <w:rFonts w:ascii="Arial" w:hAnsi="Arial"/>
+          <w:color w:val="1E293B"/>
+          <w:sz w:val="21"/>
+        </w:rPr>
+        <w:t xml:space="preserve"> | May 2018 – Jul 2020</w:t>
       </w:r>
     </w:p>
     <w:p>
@@ -512,10 +1112,19 @@
       <w:r>
         <w:rPr>
           <w:rFonts w:ascii="Arial" w:hAnsi="Arial"/>
+          <w:b/>
           <w:color w:val="1E293B"/>
           <w:sz w:val="20"/>
         </w:rPr>
-        <w:t>Modernized CI/CD pipelines to accelerate deployment velocity, enhance build reproducibility, and improve release reliability.</w:t>
+        <w:t>CI/CD Modernization:</w:t>
+      </w:r>
+      <w:r>
+        <w:rPr>
+          <w:rFonts w:ascii="Arial" w:hAnsi="Arial"/>
+          <w:color w:val="1E293B"/>
+          <w:sz w:val="20"/>
+        </w:rPr>
+        <w:t xml:space="preserve"> Redesigned CI/CD pipelines to accelerate deployment velocity, enhance build reproducibility, and improve release reliability.</w:t>
       </w:r>
     </w:p>
     <w:p>
@@ -526,10 +1135,36 @@
       <w:r>
         <w:rPr>
           <w:rFonts w:ascii="Arial" w:hAnsi="Arial"/>
+          <w:b/>
           <w:color w:val="1E293B"/>
           <w:sz w:val="20"/>
         </w:rPr>
-        <w:t>Developed shared automation libraries in Groovy standardizing build, test, and release processes across enterprise product suites.</w:t>
+        <w:t>Groovy Automation Libraries:</w:t>
+      </w:r>
+      <w:r>
+        <w:rPr>
+          <w:rFonts w:ascii="Arial" w:hAnsi="Arial"/>
+          <w:color w:val="1E293B"/>
+          <w:sz w:val="20"/>
+        </w:rPr>
+        <w:t xml:space="preserve"> Developed shared automation libraries in </w:t>
+      </w:r>
+      <w:r>
+        <w:rPr>
+          <w:rFonts w:ascii="Arial" w:hAnsi="Arial"/>
+          <w:b/>
+          <w:color w:val="1E293B"/>
+          <w:sz w:val="20"/>
+        </w:rPr>
+        <w:t>Groovy</w:t>
+      </w:r>
+      <w:r>
+        <w:rPr>
+          <w:rFonts w:ascii="Arial" w:hAnsi="Arial"/>
+          <w:color w:val="1E293B"/>
+          <w:sz w:val="20"/>
+        </w:rPr>
+        <w:t xml:space="preserve"> standardizing build, test, and release processes.</w:t>
       </w:r>
     </w:p>
     <w:p>
@@ -540,10 +1175,19 @@
       <w:r>
         <w:rPr>
           <w:rFonts w:ascii="Arial" w:hAnsi="Arial"/>
+          <w:b/>
           <w:color w:val="1E293B"/>
           <w:sz w:val="20"/>
         </w:rPr>
-        <w:t>Integrated automated security, static analysis, and code quality tooling directly into the SDLC to enforce compliance and quality gates.</w:t>
+        <w:t>SDLC Security &amp; Compliance:</w:t>
+      </w:r>
+      <w:r>
+        <w:rPr>
+          <w:rFonts w:ascii="Arial" w:hAnsi="Arial"/>
+          <w:color w:val="1E293B"/>
+          <w:sz w:val="20"/>
+        </w:rPr>
+        <w:t xml:space="preserve"> Integrated automated static code analysis, vulnerability scanning, and quality gates directly into CI/CD workflows.</w:t>
       </w:r>
     </w:p>
     <w:p>
@@ -554,10 +1198,19 @@
       <w:r>
         <w:rPr>
           <w:rFonts w:ascii="Arial" w:hAnsi="Arial"/>
+          <w:b/>
           <w:color w:val="1E293B"/>
           <w:sz w:val="20"/>
         </w:rPr>
-        <w:t>Partnered with cross-functional engineering and QA teams to eliminate bottlenecks across the software delivery lifecycle.</w:t>
+        <w:t>Bottleneck Elimination:</w:t>
+      </w:r>
+      <w:r>
+        <w:rPr>
+          <w:rFonts w:ascii="Arial" w:hAnsi="Arial"/>
+          <w:color w:val="1E293B"/>
+          <w:sz w:val="20"/>
+        </w:rPr>
+        <w:t xml:space="preserve"> Partnered with cross-functional engineering and QA leads to streamline software delivery lifecycles.</w:t>
       </w:r>
     </w:p>
     <w:p>
@@ -688,39 +1341,31 @@
     </w:p>
     <w:p>
       <w:pPr>
-        <w:pStyle w:val="ListBullet"/>
-        <w:spacing w:before="0" w:after="60"/>
+        <w:pStyle w:val="ListBullet2"/>
+        <w:spacing w:before="0" w:after="40"/>
       </w:pPr>
       <w:r>
         <w:rPr>
           <w:rFonts w:ascii="Arial" w:hAnsi="Arial"/>
+          <w:color w:val="1E293B"/>
+          <w:sz w:val="19"/>
+        </w:rPr>
+        <w:t xml:space="preserve">Dissertation:** </w:t>
+      </w:r>
+      <w:r>
+        <w:rPr>
+          <w:rFonts w:ascii="Arial" w:hAnsi="Arial"/>
           <w:b/>
-          <w:color w:val="1E293B"/>
-          <w:sz w:val="20"/>
+          <w:color w:val="326CE5"/>
+          <w:sz w:val="19"/>
         </w:rPr>
-        <w:t>Dissertation:</w:t>
+        <w:t>"Inaccuracy of Predicting Software Defects Using Supervised Machine Learning Models"</w:t>
       </w:r>
       <w:r>
         <w:rPr>
           <w:rFonts w:ascii="Arial" w:hAnsi="Arial"/>
           <w:color w:val="1E293B"/>
-          <w:sz w:val="20"/>
-        </w:rPr>
-        <w:t xml:space="preserve"> </w:t>
-      </w:r>
-      <w:r>
-        <w:rPr>
-          <w:rFonts w:ascii="Arial" w:hAnsi="Arial"/>
-          <w:color w:val="326CE5"/>
-          <w:sz w:val="20"/>
-        </w:rPr>
-        <w:t>"Inaccuracy of Predicting Software Defects Using Supervised Machine Learning Models" (https://www.proquest.com/openview/9e600d59a2bf021921d0ef87d03a9771/1.pdf?pq-origsite=gscholar&amp;cbl=18750&amp;diss=y)</w:t>
-      </w:r>
-      <w:r>
-        <w:rPr>
-          <w:rFonts w:ascii="Arial" w:hAnsi="Arial"/>
-          <w:color w:val="1E293B"/>
-          <w:sz w:val="20"/>
+          <w:sz w:val="19"/>
         </w:rPr>
         <w:t xml:space="preserve"> (ProQuest)</w:t>
       </w:r>

</xml_diff>

<commit_message>
Fix ProQuest dissertation hyperlink rendering in DOCX
</commit_message>
<xml_diff>
--- a/Veera Naidu - Executive Resume.docx
+++ b/Veera Naidu - Executive Resume.docx
@@ -25,11 +25,11 @@
       <w:r>
         <w:rPr>
           <w:rFonts w:ascii="Arial" w:hAnsi="Arial"/>
-          <w:b/>
           <w:color w:val="326CE5"/>
           <w:sz w:val="20"/>
+          <w:u w:val="single"/>
         </w:rPr>
-        <w:t>Portfolio</w:t>
+        <w:t>Portfolio (https://vb-n.github.io/portfolio/)</w:t>
       </w:r>
       <w:r>
         <w:rPr>
@@ -42,11 +42,11 @@
       <w:r>
         <w:rPr>
           <w:rFonts w:ascii="Arial" w:hAnsi="Arial"/>
-          <w:b/>
           <w:color w:val="326CE5"/>
           <w:sz w:val="20"/>
+          <w:u w:val="single"/>
         </w:rPr>
-        <w:t>LinkedIn</w:t>
+        <w:t>LinkedIn (https://linkedin.com/in/bramhavardhan)</w:t>
       </w:r>
       <w:r>
         <w:rPr>
@@ -59,11 +59,11 @@
       <w:r>
         <w:rPr>
           <w:rFonts w:ascii="Arial" w:hAnsi="Arial"/>
-          <w:b/>
           <w:color w:val="326CE5"/>
           <w:sz w:val="20"/>
+          <w:u w:val="single"/>
         </w:rPr>
-        <w:t>GitHub</w:t>
+        <w:t>GitHub (https://github.com/vb-n)</w:t>
       </w:r>
     </w:p>
     <w:p>
@@ -1355,11 +1355,11 @@
       <w:r>
         <w:rPr>
           <w:rFonts w:ascii="Arial" w:hAnsi="Arial"/>
-          <w:b/>
           <w:color w:val="326CE5"/>
           <w:sz w:val="19"/>
+          <w:u w:val="single"/>
         </w:rPr>
-        <w:t>"Inaccuracy of Predicting Software Defects Using Supervised Machine Learning Models"</w:t>
+        <w:t>"Inaccuracy of Predicting Software Defects Using Supervised Machine Learning Models" (https://www.proquest.com/openview/9e600d59a2bf021921d0ef87d03a9771/1.pdf?pq-origsite=gscholar&amp;cbl=18750&amp;diss=y)</w:t>
       </w:r>
       <w:r>
         <w:rPr>

</xml_diff>

<commit_message>
Render header links with explicit URLs in DOCX resume
</commit_message>
<xml_diff>
--- a/Veera Naidu - Executive Resume.docx
+++ b/Veera Naidu - Executive Resume.docx
@@ -26,16 +26,16 @@
         <w:rPr>
           <w:rFonts w:ascii="Arial" w:hAnsi="Arial"/>
           <w:color w:val="326CE5"/>
-          <w:sz w:val="20"/>
+          <w:sz w:val="19"/>
           <w:u w:val="single"/>
         </w:rPr>
-        <w:t>Portfolio (https://vb-n.github.io/portfolio/)</w:t>
+        <w:t>Portfolio: https://vb-n.github.io/portfolio/</w:t>
       </w:r>
       <w:r>
         <w:rPr>
           <w:rFonts w:ascii="Arial" w:hAnsi="Arial"/>
           <w:color w:val="326CE5"/>
-          <w:sz w:val="20"/>
+          <w:sz w:val="19"/>
         </w:rPr>
         <w:t xml:space="preserve"> • </w:t>
       </w:r>
@@ -43,16 +43,16 @@
         <w:rPr>
           <w:rFonts w:ascii="Arial" w:hAnsi="Arial"/>
           <w:color w:val="326CE5"/>
-          <w:sz w:val="20"/>
+          <w:sz w:val="19"/>
           <w:u w:val="single"/>
         </w:rPr>
-        <w:t>LinkedIn (https://linkedin.com/in/bramhavardhan)</w:t>
+        <w:t>LinkedIn: https://linkedin.com/in/bramhavardhan</w:t>
       </w:r>
       <w:r>
         <w:rPr>
           <w:rFonts w:ascii="Arial" w:hAnsi="Arial"/>
           <w:color w:val="326CE5"/>
-          <w:sz w:val="20"/>
+          <w:sz w:val="19"/>
         </w:rPr>
         <w:t xml:space="preserve"> • </w:t>
       </w:r>
@@ -60,10 +60,10 @@
         <w:rPr>
           <w:rFonts w:ascii="Arial" w:hAnsi="Arial"/>
           <w:color w:val="326CE5"/>
-          <w:sz w:val="20"/>
+          <w:sz w:val="19"/>
           <w:u w:val="single"/>
         </w:rPr>
-        <w:t>GitHub (https://github.com/vb-n)</w:t>
+        <w:t>GitHub: https://github.com/vb-n</w:t>
       </w:r>
     </w:p>
     <w:p>
@@ -1359,7 +1359,7 @@
           <w:sz w:val="19"/>
           <w:u w:val="single"/>
         </w:rPr>
-        <w:t>"Inaccuracy of Predicting Software Defects Using Supervised Machine Learning Models" (https://www.proquest.com/openview/9e600d59a2bf021921d0ef87d03a9771/1.pdf?pq-origsite=gscholar&amp;cbl=18750&amp;diss=y)</w:t>
+        <w:t>"Inaccuracy of Predicting Software Defects Using Supervised Machine Learning Models": https://www.proquest.com/openview/9e600d59a2bf021921d0ef87d03a9771/1.pdf?pq-origsite=gscholar&amp;cbl=18750&amp;diss=y</w:t>
       </w:r>
       <w:r>
         <w:rPr>

</xml_diff>